<commit_message>
lebenslauf in word erstellen - 50 %
</commit_message>
<xml_diff>
--- a/Aufgaben/module/Lebenslauf.docx
+++ b/Aufgaben/module/Lebenslauf.docx
@@ -14,9 +14,9 @@
       <w:r>
         <w:t>Geburtsdatum: 06.07.1992</w:t>
         <w:br/>
-        <w:t>Adresse: 66271, Kleinblittersdorf, Saargemünder Str. 135</w:t>
+        <w:t>Adresse: 66271, Klei*****, Saargemü*******</w:t>
         <w:br/>
-        <w:t>Email Adresse: Nico.Kehl92@web.de I Tel: 0174/1706642</w:t>
+        <w:t>Email Adresse: Nico.Kehl92@web.de I Tel: 0174/170****</w:t>
       </w:r>
     </w:p>
     <w:sectPr>

</xml_diff>